<commit_message>
Record v0.2.1 Zenodo DOI and refresh publication metadata
</commit_message>
<xml_diff>
--- a/publication/01_Title_Page.docx
+++ b/publication/01_Title_Page.docx
@@ -207,7 +207,7 @@
           <w:color w:val="000000"/>
           <w:sz w:val="24"/>
         </w:rPr>
-        <w:t xml:space="preserve">. The Zenodo collection (all versions) DOI is</w:t>
+        <w:t xml:space="preserve">. The Zenodo version-specific DOI is</w:t>
       </w:r>
       <w:r>
         <w:rPr>
@@ -222,7 +222,7 @@
           <w:rPr>
             <w:rStyle w:val="Hyperlink"/>
           </w:rPr>
-          <w:t xml:space="preserve">https://doi.org/10.5281/zenodo.23653765</w:t>
+          <w:t xml:space="preserve">https://doi.org/10.5281/zenodo.23670173</w:t>
         </w:r>
       </w:hyperlink>
       <w:r>

</xml_diff>